<commit_message>
Documents added and updated.
</commit_message>
<xml_diff>
--- a/Azure-Practices/AzureServiceBus/ShoppingMicroServices/Azure-POC-Documents/Tutorials-From-AzureServBus-POC/Microservices-Tutorial-Points.docx
+++ b/Azure-Practices/AzureServiceBus/ShoppingMicroServices/Azure-POC-Documents/Tutorials-From-AzureServBus-POC/Microservices-Tutorial-Points.docx
@@ -238,12 +238,117 @@
       <w:r>
         <w:t xml:space="preserve">Flow: </w:t>
       </w:r>
-      <w:r>
-        <w:rPr>
-          <w:b/>
-          <w:bCs/>
-        </w:rPr>
-        <w:t>OrderService → orderqueue → PaymentService → paymentqueue → ShippingService → shippingqueue → OrderService Listener</w:t>
+      <w:proofErr w:type="spellStart"/>
+      <w:r>
+        <w:rPr>
+          <w:b/>
+          <w:bCs/>
+        </w:rPr>
+        <w:t>OrderService</w:t>
+      </w:r>
+      <w:proofErr w:type="spellEnd"/>
+      <w:r>
+        <w:rPr>
+          <w:b/>
+          <w:bCs/>
+        </w:rPr>
+        <w:t xml:space="preserve"> → </w:t>
+      </w:r>
+      <w:proofErr w:type="spellStart"/>
+      <w:r>
+        <w:rPr>
+          <w:b/>
+          <w:bCs/>
+        </w:rPr>
+        <w:t>orderqueue</w:t>
+      </w:r>
+      <w:proofErr w:type="spellEnd"/>
+      <w:r>
+        <w:rPr>
+          <w:b/>
+          <w:bCs/>
+        </w:rPr>
+        <w:t xml:space="preserve"> → </w:t>
+      </w:r>
+      <w:proofErr w:type="spellStart"/>
+      <w:r>
+        <w:rPr>
+          <w:b/>
+          <w:bCs/>
+        </w:rPr>
+        <w:t>PaymentService</w:t>
+      </w:r>
+      <w:proofErr w:type="spellEnd"/>
+      <w:r>
+        <w:rPr>
+          <w:b/>
+          <w:bCs/>
+        </w:rPr>
+        <w:t xml:space="preserve"> → </w:t>
+      </w:r>
+      <w:proofErr w:type="spellStart"/>
+      <w:r>
+        <w:rPr>
+          <w:b/>
+          <w:bCs/>
+        </w:rPr>
+        <w:t>paymentqueue</w:t>
+      </w:r>
+      <w:proofErr w:type="spellEnd"/>
+      <w:r>
+        <w:rPr>
+          <w:b/>
+          <w:bCs/>
+        </w:rPr>
+        <w:t xml:space="preserve"> → </w:t>
+      </w:r>
+      <w:proofErr w:type="spellStart"/>
+      <w:r>
+        <w:rPr>
+          <w:b/>
+          <w:bCs/>
+        </w:rPr>
+        <w:t>ShippingService</w:t>
+      </w:r>
+      <w:proofErr w:type="spellEnd"/>
+      <w:r>
+        <w:rPr>
+          <w:b/>
+          <w:bCs/>
+        </w:rPr>
+        <w:t xml:space="preserve"> → </w:t>
+      </w:r>
+      <w:proofErr w:type="spellStart"/>
+      <w:r>
+        <w:rPr>
+          <w:b/>
+          <w:bCs/>
+        </w:rPr>
+        <w:t>shippingqueue</w:t>
+      </w:r>
+      <w:proofErr w:type="spellEnd"/>
+      <w:r>
+        <w:rPr>
+          <w:b/>
+          <w:bCs/>
+        </w:rPr>
+        <w:t xml:space="preserve"> → </w:t>
+      </w:r>
+      <w:proofErr w:type="spellStart"/>
+      <w:r>
+        <w:rPr>
+          <w:b/>
+          <w:bCs/>
+        </w:rPr>
+        <w:t>OrderService</w:t>
+      </w:r>
+      <w:proofErr w:type="spellEnd"/>
+      <w:r>
+        <w:rPr>
+          <w:b/>
+          <w:bCs/>
+        </w:rPr>
+        <w:t xml:space="preserve"> Listener</w:t>
       </w:r>
     </w:p>
     <w:p>
@@ -273,6 +378,7 @@
           <w:numId w:val="30"/>
         </w:numPr>
       </w:pPr>
+      <w:proofErr w:type="spellStart"/>
       <w:r>
         <w:rPr>
           <w:b/>
@@ -280,9 +386,15 @@
         </w:rPr>
         <w:t>OrderService</w:t>
       </w:r>
-      <w:r>
-        <w:t>: REST API to place orders → publishes to orderqueue</w:t>
-      </w:r>
+      <w:proofErr w:type="spellEnd"/>
+      <w:r>
+        <w:t xml:space="preserve">: REST API to place orders → publishes to </w:t>
+      </w:r>
+      <w:proofErr w:type="spellStart"/>
+      <w:r>
+        <w:t>orderqueue</w:t>
+      </w:r>
+      <w:proofErr w:type="spellEnd"/>
     </w:p>
     <w:p>
       <w:pPr>
@@ -291,6 +403,7 @@
           <w:numId w:val="30"/>
         </w:numPr>
       </w:pPr>
+      <w:proofErr w:type="spellStart"/>
       <w:r>
         <w:rPr>
           <w:b/>
@@ -298,9 +411,23 @@
         </w:rPr>
         <w:t>PaymentService</w:t>
       </w:r>
-      <w:r>
-        <w:t>: Background worker → consumes orderqueue, publishes to paymentqueue</w:t>
-      </w:r>
+      <w:proofErr w:type="spellEnd"/>
+      <w:r>
+        <w:t xml:space="preserve">: Background worker → consumes </w:t>
+      </w:r>
+      <w:proofErr w:type="spellStart"/>
+      <w:r>
+        <w:t>orderqueue</w:t>
+      </w:r>
+      <w:proofErr w:type="spellEnd"/>
+      <w:r>
+        <w:t xml:space="preserve">, publishes to </w:t>
+      </w:r>
+      <w:proofErr w:type="spellStart"/>
+      <w:r>
+        <w:t>paymentqueue</w:t>
+      </w:r>
+      <w:proofErr w:type="spellEnd"/>
     </w:p>
     <w:p>
       <w:pPr>
@@ -309,6 +436,7 @@
           <w:numId w:val="30"/>
         </w:numPr>
       </w:pPr>
+      <w:proofErr w:type="spellStart"/>
       <w:r>
         <w:rPr>
           <w:b/>
@@ -316,9 +444,23 @@
         </w:rPr>
         <w:t>ShippingService</w:t>
       </w:r>
-      <w:r>
-        <w:t>: Background worker → consumes paymentqueue, publishes to shippingqueue</w:t>
-      </w:r>
+      <w:proofErr w:type="spellEnd"/>
+      <w:r>
+        <w:t xml:space="preserve">: Background worker → consumes </w:t>
+      </w:r>
+      <w:proofErr w:type="spellStart"/>
+      <w:r>
+        <w:t>paymentqueue</w:t>
+      </w:r>
+      <w:proofErr w:type="spellEnd"/>
+      <w:r>
+        <w:t xml:space="preserve">, publishes to </w:t>
+      </w:r>
+      <w:proofErr w:type="spellStart"/>
+      <w:r>
+        <w:t>shippingqueue</w:t>
+      </w:r>
+      <w:proofErr w:type="spellEnd"/>
     </w:p>
     <w:p>
       <w:pPr>
@@ -327,15 +469,32 @@
           <w:numId w:val="30"/>
         </w:numPr>
       </w:pPr>
-      <w:r>
-        <w:rPr>
-          <w:b/>
-          <w:bCs/>
-        </w:rPr>
-        <w:t>OrderService Listener</w:t>
-      </w:r>
-      <w:r>
-        <w:t>: Background worker → consumes shippingqueue, updates order status</w:t>
+      <w:proofErr w:type="spellStart"/>
+      <w:r>
+        <w:rPr>
+          <w:b/>
+          <w:bCs/>
+        </w:rPr>
+        <w:t>OrderService</w:t>
+      </w:r>
+      <w:proofErr w:type="spellEnd"/>
+      <w:r>
+        <w:rPr>
+          <w:b/>
+          <w:bCs/>
+        </w:rPr>
+        <w:t xml:space="preserve"> Listener</w:t>
+      </w:r>
+      <w:r>
+        <w:t xml:space="preserve">: Background worker → consumes </w:t>
+      </w:r>
+      <w:proofErr w:type="spellStart"/>
+      <w:r>
+        <w:t>shippingqueue</w:t>
+      </w:r>
+      <w:proofErr w:type="spellEnd"/>
+      <w:r>
+        <w:t>, updates order status</w:t>
       </w:r>
     </w:p>
     <w:p>
@@ -369,7 +528,15 @@
         </w:numPr>
       </w:pPr>
       <w:r>
-        <w:t>Place order via OrderService API</w:t>
+        <w:t xml:space="preserve">Place order via </w:t>
+      </w:r>
+      <w:proofErr w:type="spellStart"/>
+      <w:r>
+        <w:t>OrderService</w:t>
+      </w:r>
+      <w:proofErr w:type="spellEnd"/>
+      <w:r>
+        <w:t xml:space="preserve"> API</w:t>
       </w:r>
     </w:p>
     <w:p>
@@ -380,7 +547,15 @@
         </w:numPr>
       </w:pPr>
       <w:r>
-        <w:t>Verify PaymentService logs (payment processed)</w:t>
+        <w:t xml:space="preserve">Verify </w:t>
+      </w:r>
+      <w:proofErr w:type="spellStart"/>
+      <w:r>
+        <w:t>PaymentService</w:t>
+      </w:r>
+      <w:proofErr w:type="spellEnd"/>
+      <w:r>
+        <w:t xml:space="preserve"> logs (payment processed)</w:t>
       </w:r>
     </w:p>
     <w:p>
@@ -391,7 +566,15 @@
         </w:numPr>
       </w:pPr>
       <w:r>
-        <w:t>Verify ShippingService logs (shipping started)</w:t>
+        <w:t xml:space="preserve">Verify </w:t>
+      </w:r>
+      <w:proofErr w:type="spellStart"/>
+      <w:r>
+        <w:t>ShippingService</w:t>
+      </w:r>
+      <w:proofErr w:type="spellEnd"/>
+      <w:r>
+        <w:t xml:space="preserve"> logs (shipping started)</w:t>
       </w:r>
     </w:p>
     <w:p>
@@ -402,7 +585,15 @@
         </w:numPr>
       </w:pPr>
       <w:r>
-        <w:t>Verify OrderService Listener logs (order marked shipped)</w:t>
+        <w:t xml:space="preserve">Verify </w:t>
+      </w:r>
+      <w:proofErr w:type="spellStart"/>
+      <w:r>
+        <w:t>OrderService</w:t>
+      </w:r>
+      <w:proofErr w:type="spellEnd"/>
+      <w:r>
+        <w:t xml:space="preserve"> Listener logs (order marked shipped)</w:t>
       </w:r>
     </w:p>
     <w:p>
@@ -512,6 +703,22 @@
           <w:bCs/>
         </w:rPr>
         <w:t>Test Case 1: API Gateway Authentication</w:t>
+      </w:r>
+      <w:r>
+        <w:rPr>
+          <w:b/>
+          <w:bCs/>
+        </w:rPr>
+        <w:t xml:space="preserve"> </w:t>
+      </w:r>
+      <w:r>
+        <w:t xml:space="preserve">(Refer </w:t>
+      </w:r>
+      <w:r>
+        <w:t>Microservices-ApiManagement</w:t>
+      </w:r>
+      <w:r>
+        <w:t>.doc)</w:t>
       </w:r>
     </w:p>
     <w:p>
@@ -547,7 +754,23 @@
         <w:t>Validation:</w:t>
       </w:r>
       <w:r>
-        <w:t xml:space="preserve"> Call OrderService /api/order/place with and without valid token.</w:t>
+        <w:t xml:space="preserve"> Call </w:t>
+      </w:r>
+      <w:proofErr w:type="spellStart"/>
+      <w:r>
+        <w:t>OrderService</w:t>
+      </w:r>
+      <w:proofErr w:type="spellEnd"/>
+      <w:r>
+        <w:t xml:space="preserve"> /</w:t>
+      </w:r>
+      <w:proofErr w:type="spellStart"/>
+      <w:r>
+        <w:t>api</w:t>
+      </w:r>
+      <w:proofErr w:type="spellEnd"/>
+      <w:r>
+        <w:t>/order/place with and without valid token.</w:t>
       </w:r>
     </w:p>
     <w:p>
@@ -655,7 +878,23 @@
         <w:t>Action:</w:t>
       </w:r>
       <w:r>
-        <w:t xml:space="preserve"> PaymentService and ShippingService authenticate via managed identities.</w:t>
+        <w:t xml:space="preserve"> </w:t>
+      </w:r>
+      <w:proofErr w:type="spellStart"/>
+      <w:r>
+        <w:t>PaymentService</w:t>
+      </w:r>
+      <w:proofErr w:type="spellEnd"/>
+      <w:r>
+        <w:t xml:space="preserve"> and </w:t>
+      </w:r>
+      <w:proofErr w:type="spellStart"/>
+      <w:r>
+        <w:t>ShippingService</w:t>
+      </w:r>
+      <w:proofErr w:type="spellEnd"/>
+      <w:r>
+        <w:t xml:space="preserve"> authenticate via managed identities.</w:t>
       </w:r>
     </w:p>
     <w:p>
@@ -814,7 +1053,15 @@
         <w:t>Validation:</w:t>
       </w:r>
       <w:r>
-        <w:t xml:space="preserve"> Flood OrderService endpoint.</w:t>
+        <w:t xml:space="preserve"> Flood </w:t>
+      </w:r>
+      <w:proofErr w:type="spellStart"/>
+      <w:r>
+        <w:t>OrderService</w:t>
+      </w:r>
+      <w:proofErr w:type="spellEnd"/>
+      <w:r>
+        <w:t xml:space="preserve"> endpoint.</w:t>
       </w:r>
     </w:p>
     <w:p>
@@ -856,8 +1103,17 @@
           <w:b/>
           <w:bCs/>
         </w:rPr>
-        <w:t>Test Case 6: Stress Test OrderService</w:t>
-      </w:r>
+        <w:t xml:space="preserve">Test Case 6: Stress Test </w:t>
+      </w:r>
+      <w:proofErr w:type="spellStart"/>
+      <w:r>
+        <w:rPr>
+          <w:b/>
+          <w:bCs/>
+        </w:rPr>
+        <w:t>OrderService</w:t>
+      </w:r>
+      <w:proofErr w:type="spellEnd"/>
     </w:p>
     <w:p>
       <w:pPr>
@@ -874,7 +1130,15 @@
         <w:t>Action:</w:t>
       </w:r>
       <w:r>
-        <w:t xml:space="preserve"> Send 10k+ concurrent requests to /api/order/place.</w:t>
+        <w:t xml:space="preserve"> Send 10k+ concurrent requests to /</w:t>
+      </w:r>
+      <w:proofErr w:type="spellStart"/>
+      <w:r>
+        <w:t>api</w:t>
+      </w:r>
+      <w:proofErr w:type="spellEnd"/>
+      <w:r>
+        <w:t>/order/place.</w:t>
       </w:r>
     </w:p>
     <w:p>
@@ -937,7 +1201,23 @@
         <w:t>Action:</w:t>
       </w:r>
       <w:r>
-        <w:t xml:space="preserve"> Flood orderqueue faster than PaymentService can consume.</w:t>
+        <w:t xml:space="preserve"> Flood </w:t>
+      </w:r>
+      <w:proofErr w:type="spellStart"/>
+      <w:r>
+        <w:t>orderqueue</w:t>
+      </w:r>
+      <w:proofErr w:type="spellEnd"/>
+      <w:r>
+        <w:t xml:space="preserve"> faster than </w:t>
+      </w:r>
+      <w:proofErr w:type="spellStart"/>
+      <w:r>
+        <w:t>PaymentService</w:t>
+      </w:r>
+      <w:proofErr w:type="spellEnd"/>
+      <w:r>
+        <w:t xml:space="preserve"> can consume.</w:t>
       </w:r>
     </w:p>
     <w:p>
@@ -1016,7 +1296,15 @@
         <w:t>Action:</w:t>
       </w:r>
       <w:r>
-        <w:t xml:space="preserve"> Deploy new image version for PaymentService.</w:t>
+        <w:t xml:space="preserve"> Deploy new image version for </w:t>
+      </w:r>
+      <w:proofErr w:type="spellStart"/>
+      <w:r>
+        <w:t>PaymentService</w:t>
+      </w:r>
+      <w:proofErr w:type="spellEnd"/>
+      <w:r>
+        <w:t>.</w:t>
       </w:r>
     </w:p>
     <w:p>
@@ -1079,7 +1367,15 @@
         <w:t>Action:</w:t>
       </w:r>
       <w:r>
-        <w:t xml:space="preserve"> Kill a ShippingService pod manually.</w:t>
+        <w:t xml:space="preserve"> Kill a </w:t>
+      </w:r>
+      <w:proofErr w:type="spellStart"/>
+      <w:r>
+        <w:t>ShippingService</w:t>
+      </w:r>
+      <w:proofErr w:type="spellEnd"/>
+      <w:r>
+        <w:t xml:space="preserve"> pod manually.</w:t>
       </w:r>
     </w:p>
     <w:p>
@@ -1142,7 +1438,31 @@
         <w:t>Action:</w:t>
       </w:r>
       <w:r>
-        <w:t xml:space="preserve"> Run az aks upgrade --kubernetes-version &lt;new-version&gt;.</w:t>
+        <w:t xml:space="preserve"> Run </w:t>
+      </w:r>
+      <w:proofErr w:type="spellStart"/>
+      <w:r>
+        <w:t>az</w:t>
+      </w:r>
+      <w:proofErr w:type="spellEnd"/>
+      <w:r>
+        <w:t xml:space="preserve"> </w:t>
+      </w:r>
+      <w:proofErr w:type="spellStart"/>
+      <w:r>
+        <w:t>aks</w:t>
+      </w:r>
+      <w:proofErr w:type="spellEnd"/>
+      <w:r>
+        <w:t xml:space="preserve"> upgrade --</w:t>
+      </w:r>
+      <w:proofErr w:type="spellStart"/>
+      <w:r>
+        <w:t>kubernetes</w:t>
+      </w:r>
+      <w:proofErr w:type="spellEnd"/>
+      <w:r>
+        <w:t>-version &lt;new-version&gt;.</w:t>
       </w:r>
     </w:p>
     <w:p>
@@ -7945,6 +8265,7 @@
   <w:style w:type="character" w:default="1" w:styleId="DefaultParagraphFont">
     <w:name w:val="Default Paragraph Font"/>
     <w:uiPriority w:val="1"/>
+    <w:semiHidden/>
     <w:unhideWhenUsed/>
   </w:style>
   <w:style w:type="table" w:default="1" w:styleId="TableNormal">

</xml_diff>